<commit_message>
Tanggal dokumen Termin 1 Field Testing, Laporan FAT, dan Uji Lab: 5 Oktober 2026
Co-Authored-By: Claude Opus 5.5 <noreply@anthropic.com>
Claude-Session: https://claude.ai/code/session_01QPUbK2zC1BgtHo8HLyyaSC
</commit_message>
<xml_diff>
--- a/Paket Pertamina/04_Laporan_Termin_1/Laporan_Pemenuhan_Deliverable_Termin_1_FieldTesting_GLD_Rev03.docx
+++ b/Paket Pertamina/04_Laporan_Termin_1/Laporan_Pemenuhan_Deliverable_Termin_1_FieldTesting_GLD_Rev03.docx
@@ -233,7 +233,7 @@
                 <w:color w:val="20262B"/>
                 <w:sz w:val="18"/>
               </w:rPr>
-              <w:t>4 Oktober 2026</w:t>
+              <w:t>5 Oktober 2026</w:t>
             </w:r>
           </w:p>
         </w:tc>
@@ -478,7 +478,7 @@
           <w:color w:val="20262B"/>
           <w:sz w:val="21"/>
         </w:rPr>
-        <w:t>Berdasarkan bukti teknis dan dokumentasi yang tersedia sampai 4 Oktober 2026, pekerjaan Termin 1 telah mencapai penyelesaian substansial pada tahap rekayasa dan integrasi laboratorium. Paket ini layak diajukan kepada PT Pertamina Patra Niaga untuk evaluasi, penerimaan, dan pembayaran Termin 1 sebesar 20 persen.</w:t>
+        <w:t>Berdasarkan bukti teknis dan dokumentasi yang tersedia sampai 5 Oktober 2026, pekerjaan Termin 1 telah mencapai penyelesaian substansial pada tahap rekayasa dan integrasi laboratorium. Paket ini layak diajukan kepada PT Pertamina Patra Niaga untuk evaluasi, penerimaan, dan pembayaran Termin 1 sebesar 20 persen.</w:t>
       </w:r>
     </w:p>
     <w:p>

</xml_diff>